<commit_message>
pricing: tiered onboarding fee (from ₦30k, managed setup ₦100k)
A flat ₦100k setup was too high for the mass-market micro-vendor segment. Switch
to a tiered fee: a ₦30,000 headline "from" price for standard onboarding, plus a
₦100,000 fully-managed-setup anchor for established / multi-branch businesses.

- New ONBOARDING_FEE_PREMIUM_NGN env var; ONBOARDING_FEE_NGN default now 30,000.
- Landing-page pricing copy and flier show "from ₦30,000" with the managed-setup
  anchor; flier re-rendered.
- Go-Live guide env checklist updated for both fee vars.

Co-Authored-By: Claude Fable 5 <noreply@anthropic.com>
</commit_message>
<xml_diff>
--- a/docs/guides/Collxct-Go-Live-Guide.docx
+++ b/docs/guides/Collxct-Go-Live-Guide.docx
@@ -367,7 +367,7 @@
           </w:tcPr>
           <w:p>
             <w:r>
-              <w:t>ONBOARDING_FEE_NGN</w:t>
+              <w:t>ONBOARDING_FEE_NGN / ONBOARDING_FEE_PREMIUM_NGN</w:t>
             </w:r>
           </w:p>
         </w:tc>
@@ -377,7 +377,7 @@
           </w:tcPr>
           <w:p>
             <w:r>
-              <w:t>One-time setup fee shown on the landing page (default 100,000).</w:t>
+              <w:t>Setup fees on the landing page: standard 'from' price (default 30,000) and the managed-setup anchor for established/multi-branch businesses (default 100,000).</w:t>
             </w:r>
           </w:p>
         </w:tc>

</xml_diff>